<commit_message>
docs: update project reporting and contribution materials
</commit_message>
<xml_diff>
--- a/docs/项目式课程阶段2成员分工及贡献度 .docx
+++ b/docs/项目式课程阶段2成员分工及贡献度 .docx
@@ -1,6 +1,6 @@
 
 <file path=word/document.xml><?xml version="1.0" encoding="utf-8"?>
-<w:document xmlns:wpc="http://schemas.microsoft.com/office/word/2010/wordprocessingCanvas" xmlns:cx="http://schemas.microsoft.com/office/drawing/2014/chartex" xmlns:cx1="http://schemas.microsoft.com/office/drawing/2015/9/8/chartex" xmlns:mc="http://schemas.openxmlformats.org/markup-compatibility/2006" xmlns:o="urn:schemas-microsoft-com:office:office" xmlns:r="http://schemas.openxmlformats.org/officeDocument/2006/relationships" xmlns:m="http://schemas.openxmlformats.org/officeDocument/2006/math" xmlns:v="urn:schemas-microsoft-com:vml" xmlns:wp14="http://schemas.microsoft.com/office/word/2010/wordprocessingDrawing" xmlns:wp="http://schemas.openxmlformats.org/drawingml/2006/wordprocessingDrawing" xmlns:w10="urn:schemas-microsoft-com:office:word" xmlns:w="http://schemas.openxmlformats.org/wordprocessingml/2006/main" xmlns:w14="http://schemas.microsoft.com/office/word/2010/wordml" xmlns:w15="http://schemas.microsoft.com/office/word/2012/wordml" xmlns:w16se="http://schemas.microsoft.com/office/word/2015/wordml/symex" xmlns:wpg="http://schemas.microsoft.com/office/word/2010/wordprocessingGroup" xmlns:wpi="http://schemas.microsoft.com/office/word/2010/wordprocessingInk" xmlns:wne="http://schemas.microsoft.com/office/word/2006/wordml" xmlns:wps="http://schemas.microsoft.com/office/word/2010/wordprocessingShape" mc:Ignorable="w14 w15 w16se wp14">
+<w:document xmlns:wpc="http://schemas.microsoft.com/office/word/2010/wordprocessingCanvas" xmlns:cx="http://schemas.microsoft.com/office/drawing/2014/chartex" xmlns:cx1="http://schemas.microsoft.com/office/drawing/2015/9/8/chartex" xmlns:cx2="http://schemas.microsoft.com/office/drawing/2015/10/21/chartex" xmlns:cx3="http://schemas.microsoft.com/office/drawing/2016/5/9/chartex" xmlns:cx4="http://schemas.microsoft.com/office/drawing/2016/5/10/chartex" xmlns:cx5="http://schemas.microsoft.com/office/drawing/2016/5/11/chartex" xmlns:cx6="http://schemas.microsoft.com/office/drawing/2016/5/12/chartex" xmlns:cx7="http://schemas.microsoft.com/office/drawing/2016/5/13/chartex" xmlns:cx8="http://schemas.microsoft.com/office/drawing/2016/5/14/chartex" xmlns:mc="http://schemas.openxmlformats.org/markup-compatibility/2006" xmlns:aink="http://schemas.microsoft.com/office/drawing/2016/ink" xmlns:am3d="http://schemas.microsoft.com/office/drawing/2017/model3d" xmlns:o="urn:schemas-microsoft-com:office:office" xmlns:oel="http://schemas.microsoft.com/office/2019/extlst" xmlns:r="http://schemas.openxmlformats.org/officeDocument/2006/relationships" xmlns:m="http://schemas.openxmlformats.org/officeDocument/2006/math" xmlns:v="urn:schemas-microsoft-com:vml" xmlns:wp14="http://schemas.microsoft.com/office/word/2010/wordprocessingDrawing" xmlns:wp="http://schemas.openxmlformats.org/drawingml/2006/wordprocessingDrawing" xmlns:w10="urn:schemas-microsoft-com:office:word" xmlns:w="http://schemas.openxmlformats.org/wordprocessingml/2006/main" xmlns:w14="http://schemas.microsoft.com/office/word/2010/wordml" xmlns:w15="http://schemas.microsoft.com/office/word/2012/wordml" xmlns:w16cex="http://schemas.microsoft.com/office/word/2018/wordml/cex" xmlns:w16cid="http://schemas.microsoft.com/office/word/2016/wordml/cid" xmlns:w16="http://schemas.microsoft.com/office/word/2018/wordml" xmlns:w16du="http://schemas.microsoft.com/office/word/2023/wordml/word16du" xmlns:w16sdtdh="http://schemas.microsoft.com/office/word/2020/wordml/sdtdatahash" xmlns:w16sdtfl="http://schemas.microsoft.com/office/word/2024/wordml/sdtformatlock" xmlns:w16se="http://schemas.microsoft.com/office/word/2015/wordml/symex" xmlns:wpg="http://schemas.microsoft.com/office/word/2010/wordprocessingGroup" xmlns:wpi="http://schemas.microsoft.com/office/word/2010/wordprocessingInk" xmlns:wne="http://schemas.microsoft.com/office/word/2006/wordml" xmlns:wps="http://schemas.microsoft.com/office/word/2010/wordprocessingShape" mc:Ignorable="w14 w15 w16se w16cid w16 w16cex w16sdtdh w16sdtfl w16du wp14">
   <w:body>
     <w:tbl>
       <w:tblPr>
@@ -28,7 +28,7 @@
       </w:tblGrid>
       <w:tr>
         <w:trPr>
-          <w:trHeight w:hRule="exact" w:val="581"/>
+          <w:trHeight w:hRule="exact" w:val="352"/>
         </w:trPr>
         <w:tc>
           <w:tcPr>
@@ -42,28 +42,28 @@
               <w:spacing w:line="320" w:lineRule="exact"/>
               <w:jc w:val="center"/>
               <w:rPr>
+                <w:rFonts w:ascii="微软雅黑" w:eastAsia="微软雅黑" w:hAnsi="微软雅黑" w:hint="eastAsia"/>
+                <w:b/>
+                <w:bCs/>
+                <w:sz w:val="24"/>
+              </w:rPr>
+            </w:pPr>
+            <w:r>
+              <w:rPr>
+                <w:rFonts w:ascii="微软雅黑" w:eastAsia="微软雅黑" w:hAnsi="微软雅黑" w:hint="eastAsia"/>
+                <w:b/>
+                <w:bCs/>
+                <w:sz w:val="24"/>
+              </w:rPr>
+              <w:t>项目式课程阶段2</w:t>
+            </w:r>
+            <w:r>
+              <w:rPr>
                 <w:rFonts w:ascii="微软雅黑" w:eastAsia="微软雅黑" w:hAnsi="微软雅黑"/>
                 <w:b/>
                 <w:bCs/>
                 <w:sz w:val="24"/>
               </w:rPr>
-            </w:pPr>
-            <w:r>
-              <w:rPr>
-                <w:rFonts w:ascii="微软雅黑" w:eastAsia="微软雅黑" w:hAnsi="微软雅黑" w:hint="eastAsia"/>
-                <w:b/>
-                <w:bCs/>
-                <w:sz w:val="24"/>
-              </w:rPr>
-              <w:t>项目式课程阶段2</w:t>
-            </w:r>
-            <w:r>
-              <w:rPr>
-                <w:rFonts w:ascii="微软雅黑" w:eastAsia="微软雅黑" w:hAnsi="微软雅黑"/>
-                <w:b/>
-                <w:bCs/>
-                <w:sz w:val="24"/>
-              </w:rPr>
               <w:t>-</w:t>
             </w:r>
             <w:r>
@@ -102,6 +102,16 @@
                 <w:bCs/>
                 <w:sz w:val="24"/>
               </w:rPr>
+              <w:t xml:space="preserve">   组号：</w:t>
+            </w:r>
+            <w:r>
+              <w:rPr>
+                <w:rFonts w:ascii="微软雅黑" w:eastAsia="微软雅黑" w:hAnsi="微软雅黑" w:hint="eastAsia"/>
+                <w:b/>
+                <w:bCs/>
+                <w:sz w:val="24"/>
+                <w:u w:val="single"/>
+              </w:rPr>
               <w:t xml:space="preserve">   </w:t>
             </w:r>
             <w:r>
@@ -110,25 +120,36 @@
                 <w:b/>
                 <w:bCs/>
                 <w:sz w:val="24"/>
-              </w:rPr>
-              <w:t>组号：</w:t>
-            </w:r>
-            <w:r>
-              <w:rPr>
-                <w:rFonts w:ascii="微软雅黑" w:eastAsia="微软雅黑" w:hAnsi="微软雅黑" w:hint="eastAsia"/>
-                <w:b/>
-                <w:bCs/>
-                <w:sz w:val="24"/>
                 <w:u w:val="single"/>
               </w:rPr>
-              <w:t xml:space="preserve">        </w:t>
-            </w:r>
-            <w:r>
-              <w:rPr>
-                <w:rFonts w:ascii="微软雅黑" w:eastAsia="微软雅黑" w:hAnsi="微软雅黑" w:hint="eastAsia"/>
-                <w:b/>
-                <w:bCs/>
-                <w:sz w:val="24"/>
+              <w:t>32</w:t>
+            </w:r>
+            <w:r>
+              <w:rPr>
+                <w:rFonts w:ascii="微软雅黑" w:eastAsia="微软雅黑" w:hAnsi="微软雅黑" w:hint="eastAsia"/>
+                <w:b/>
+                <w:bCs/>
+                <w:sz w:val="24"/>
+                <w:u w:val="single"/>
+              </w:rPr>
+              <w:t xml:space="preserve">     </w:t>
+            </w:r>
+            <w:r>
+              <w:rPr>
+                <w:rFonts w:ascii="微软雅黑" w:eastAsia="微软雅黑" w:hAnsi="微软雅黑" w:hint="eastAsia"/>
+                <w:b/>
+                <w:bCs/>
+                <w:sz w:val="24"/>
+              </w:rPr>
+              <w:t xml:space="preserve">   验收时间 </w:t>
+            </w:r>
+            <w:r>
+              <w:rPr>
+                <w:rFonts w:ascii="微软雅黑" w:eastAsia="微软雅黑" w:hAnsi="微软雅黑" w:hint="eastAsia"/>
+                <w:b/>
+                <w:bCs/>
+                <w:sz w:val="24"/>
+                <w:u w:val="single"/>
               </w:rPr>
               <w:t xml:space="preserve">   </w:t>
             </w:r>
@@ -138,27 +159,9 @@
                 <w:b/>
                 <w:bCs/>
                 <w:sz w:val="24"/>
-              </w:rPr>
-              <w:t>验收时间</w:t>
-            </w:r>
-            <w:r>
-              <w:rPr>
-                <w:rFonts w:ascii="微软雅黑" w:eastAsia="微软雅黑" w:hAnsi="微软雅黑" w:hint="eastAsia"/>
-                <w:b/>
-                <w:bCs/>
-                <w:sz w:val="24"/>
-              </w:rPr>
-              <w:t xml:space="preserve"> </w:t>
-            </w:r>
-            <w:r>
-              <w:rPr>
-                <w:rFonts w:ascii="微软雅黑" w:eastAsia="微软雅黑" w:hAnsi="微软雅黑" w:hint="eastAsia"/>
-                <w:b/>
-                <w:bCs/>
-                <w:sz w:val="24"/>
                 <w:u w:val="single"/>
               </w:rPr>
-              <w:t xml:space="preserve">     </w:t>
+              <w:t>7</w:t>
             </w:r>
             <w:r>
               <w:rPr>
@@ -168,7 +171,7 @@
                 <w:sz w:val="24"/>
                 <w:u w:val="single"/>
               </w:rPr>
-              <w:t>月</w:t>
+              <w:t xml:space="preserve">  月  </w:t>
             </w:r>
             <w:r>
               <w:rPr>
@@ -178,7 +181,7 @@
                 <w:sz w:val="24"/>
                 <w:u w:val="single"/>
               </w:rPr>
-              <w:t xml:space="preserve">    </w:t>
+              <w:t>13</w:t>
             </w:r>
             <w:r>
               <w:rPr>
@@ -188,14 +191,14 @@
                 <w:sz w:val="24"/>
                 <w:u w:val="single"/>
               </w:rPr>
-              <w:t>日</w:t>
+              <w:t xml:space="preserve">  日</w:t>
             </w:r>
           </w:p>
         </w:tc>
       </w:tr>
       <w:tr>
         <w:trPr>
-          <w:trHeight w:hRule="exact" w:val="1408"/>
+          <w:trHeight w:hRule="exact" w:val="3534"/>
         </w:trPr>
         <w:tc>
           <w:tcPr>
@@ -208,20 +211,20 @@
               <w:spacing w:line="320" w:lineRule="exact"/>
               <w:jc w:val="center"/>
               <w:rPr>
-                <w:rFonts w:ascii="微软雅黑" w:eastAsia="微软雅黑" w:hAnsi="微软雅黑"/>
-                <w:b/>
-                <w:bCs/>
-                <w:sz w:val="24"/>
-              </w:rPr>
-            </w:pPr>
-            <w:r>
-              <w:rPr>
-                <w:rFonts w:ascii="微软雅黑" w:eastAsia="微软雅黑" w:hAnsi="微软雅黑" w:hint="eastAsia"/>
-                <w:b/>
-                <w:bCs/>
-                <w:sz w:val="24"/>
-              </w:rPr>
-              <w:t>项目A</w:t>
+                <w:rFonts w:ascii="微软雅黑" w:eastAsia="微软雅黑" w:hAnsi="微软雅黑" w:hint="eastAsia"/>
+                <w:b/>
+                <w:bCs/>
+                <w:sz w:val="24"/>
+              </w:rPr>
+            </w:pPr>
+            <w:r>
+              <w:rPr>
+                <w:rFonts w:ascii="微软雅黑" w:eastAsia="微软雅黑" w:hAnsi="微软雅黑" w:hint="eastAsia"/>
+                <w:b/>
+                <w:bCs/>
+                <w:sz w:val="24"/>
+              </w:rPr>
+              <w:t>项目B</w:t>
             </w:r>
           </w:p>
         </w:tc>
@@ -234,8 +237,10 @@
             <w:pPr>
               <w:widowControl/>
               <w:spacing w:line="320" w:lineRule="exact"/>
-              <w:rPr>
-                <w:rFonts w:ascii="微软雅黑" w:eastAsia="微软雅黑" w:hAnsi="微软雅黑"/>
+              <w:jc w:val="left"/>
+              <w:rPr>
+                <w:rFonts w:ascii="微软雅黑" w:eastAsia="微软雅黑" w:hAnsi="微软雅黑" w:hint="eastAsia"/>
+                <w:b/>
                 <w:bCs/>
                 <w:sz w:val="24"/>
               </w:rPr>
@@ -270,38 +275,116 @@
             </w:pPr>
             <w:r>
               <w:rPr>
-                <w:rFonts w:ascii="微软雅黑" w:eastAsia="微软雅黑" w:hAnsi="微软雅黑" w:hint="eastAsia"/>
-                <w:bCs/>
-                <w:sz w:val="24"/>
-              </w:rPr>
-              <w:t>（简述基础层次控制器完成情况）</w:t>
-            </w:r>
-          </w:p>
+                <w:rFonts w:ascii="微软雅黑" w:eastAsia="微软雅黑" w:hAnsi="微软雅黑"/>
+                <w:bCs/>
+                <w:sz w:val="24"/>
+              </w:rPr>
+              <w:t xml:space="preserve">已完成基于 RISC-V RV32I 子集的 6 状态多周期 CPU 设计与实现，支持 31 </w:t>
+            </w:r>
+            <w:proofErr w:type="gramStart"/>
+            <w:r>
+              <w:rPr>
+                <w:rFonts w:ascii="微软雅黑" w:eastAsia="微软雅黑" w:hAnsi="微软雅黑"/>
+                <w:bCs/>
+                <w:sz w:val="24"/>
+              </w:rPr>
+              <w:t>条基础</w:t>
+            </w:r>
+            <w:proofErr w:type="gramEnd"/>
+            <w:r>
+              <w:rPr>
+                <w:rFonts w:ascii="微软雅黑" w:eastAsia="微软雅黑" w:hAnsi="微软雅黑"/>
+                <w:bCs/>
+                <w:sz w:val="24"/>
+              </w:rPr>
+              <w:t>指令及 1 条 MAC 自定义指令，完成 ALU、</w:t>
+            </w:r>
+            <w:proofErr w:type="spellStart"/>
+            <w:r>
+              <w:rPr>
+                <w:rFonts w:ascii="微软雅黑" w:eastAsia="微软雅黑" w:hAnsi="微软雅黑"/>
+                <w:bCs/>
+                <w:sz w:val="24"/>
+              </w:rPr>
+              <w:t>regfile</w:t>
+            </w:r>
+            <w:proofErr w:type="spellEnd"/>
+            <w:r>
+              <w:rPr>
+                <w:rFonts w:ascii="微软雅黑" w:eastAsia="微软雅黑" w:hAnsi="微软雅黑"/>
+                <w:bCs/>
+                <w:sz w:val="24"/>
+              </w:rPr>
+              <w:t>、</w:t>
+            </w:r>
+            <w:proofErr w:type="spellStart"/>
+            <w:r>
+              <w:rPr>
+                <w:rFonts w:ascii="微软雅黑" w:eastAsia="微软雅黑" w:hAnsi="微软雅黑"/>
+                <w:bCs/>
+                <w:sz w:val="24"/>
+              </w:rPr>
+              <w:t>control_unit</w:t>
+            </w:r>
+            <w:proofErr w:type="spellEnd"/>
+            <w:r>
+              <w:rPr>
+                <w:rFonts w:ascii="微软雅黑" w:eastAsia="微软雅黑" w:hAnsi="微软雅黑"/>
+                <w:bCs/>
+                <w:sz w:val="24"/>
+              </w:rPr>
+              <w:t xml:space="preserve">、basic、LW/SW、BEQ/BNE 等单元与扩展仿真验证。项目已通过 </w:t>
+            </w:r>
+            <w:proofErr w:type="spellStart"/>
+            <w:r>
+              <w:rPr>
+                <w:rFonts w:ascii="微软雅黑" w:eastAsia="微软雅黑" w:hAnsi="微软雅黑"/>
+                <w:bCs/>
+                <w:sz w:val="24"/>
+              </w:rPr>
+              <w:t>Vivado</w:t>
+            </w:r>
+            <w:proofErr w:type="spellEnd"/>
+            <w:r>
+              <w:rPr>
+                <w:rFonts w:ascii="微软雅黑" w:eastAsia="微软雅黑" w:hAnsi="微软雅黑"/>
+                <w:bCs/>
+                <w:sz w:val="24"/>
+              </w:rPr>
+              <w:t xml:space="preserve"> 综合、实现和 bitstream 生成，达到 100MHz 目标时钟要求，WNS=+7.212ns、DRC=0，说明基础 CPU 具备完整功能、可靠时序和</w:t>
+            </w:r>
+            <w:proofErr w:type="gramStart"/>
+            <w:r>
+              <w:rPr>
+                <w:rFonts w:ascii="微软雅黑" w:eastAsia="微软雅黑" w:hAnsi="微软雅黑"/>
+                <w:bCs/>
+                <w:sz w:val="24"/>
+              </w:rPr>
+              <w:t>可</w:t>
+            </w:r>
+            <w:proofErr w:type="gramEnd"/>
+            <w:r>
+              <w:rPr>
+                <w:rFonts w:ascii="微软雅黑" w:eastAsia="微软雅黑" w:hAnsi="微软雅黑"/>
+                <w:bCs/>
+                <w:sz w:val="24"/>
+              </w:rPr>
+              <w:t>上板能力。</w:t>
+            </w:r>
+          </w:p>
+        </w:tc>
+        <w:tc>
+          <w:tcPr>
+            <w:tcW w:w="709" w:type="dxa"/>
+            <w:vAlign w:val="center"/>
+          </w:tcPr>
           <w:p>
             <w:pPr>
               <w:widowControl/>
               <w:spacing w:line="320" w:lineRule="exact"/>
               <w:jc w:val="left"/>
               <w:rPr>
-                <w:rFonts w:ascii="微软雅黑" w:eastAsia="微软雅黑" w:hAnsi="微软雅黑"/>
-                <w:bCs/>
-                <w:sz w:val="24"/>
-              </w:rPr>
-            </w:pPr>
-          </w:p>
-        </w:tc>
-        <w:tc>
-          <w:tcPr>
-            <w:tcW w:w="709" w:type="dxa"/>
-            <w:vAlign w:val="center"/>
-          </w:tcPr>
-          <w:p>
-            <w:pPr>
-              <w:widowControl/>
-              <w:spacing w:line="320" w:lineRule="exact"/>
-              <w:jc w:val="left"/>
-              <w:rPr>
-                <w:rFonts w:ascii="微软雅黑" w:eastAsia="微软雅黑" w:hAnsi="微软雅黑"/>
+                <w:rFonts w:ascii="微软雅黑" w:eastAsia="微软雅黑" w:hAnsi="微软雅黑" w:hint="eastAsia"/>
                 <w:b/>
                 <w:bCs/>
                 <w:sz w:val="24"/>
@@ -337,70 +420,63 @@
             </w:pPr>
             <w:r>
               <w:rPr>
-                <w:rFonts w:ascii="微软雅黑" w:eastAsia="微软雅黑" w:hAnsi="微软雅黑" w:hint="eastAsia"/>
-                <w:bCs/>
-                <w:sz w:val="24"/>
-              </w:rPr>
-              <w:t>（简述进阶与拓展</w:t>
-            </w:r>
-            <w:r>
-              <w:rPr>
-                <w:rFonts w:ascii="微软雅黑" w:eastAsia="微软雅黑" w:hAnsi="微软雅黑" w:hint="eastAsia"/>
-                <w:bCs/>
-                <w:sz w:val="24"/>
-              </w:rPr>
-              <w:t>层次</w:t>
-            </w:r>
-            <w:bookmarkStart w:id="0" w:name="_GoBack"/>
-            <w:bookmarkEnd w:id="0"/>
-            <w:r>
-              <w:rPr>
-                <w:rFonts w:ascii="微软雅黑" w:eastAsia="微软雅黑" w:hAnsi="微软雅黑" w:hint="eastAsia"/>
-                <w:bCs/>
-                <w:sz w:val="24"/>
-              </w:rPr>
-              <w:t>完成情况）</w:t>
-            </w:r>
-          </w:p>
-        </w:tc>
-      </w:tr>
-      <w:tr>
-        <w:trPr>
-          <w:trHeight w:hRule="exact" w:val="1416"/>
-        </w:trPr>
-        <w:tc>
-          <w:tcPr>
-            <w:tcW w:w="1588" w:type="dxa"/>
-            <w:vAlign w:val="center"/>
-          </w:tcPr>
-          <w:p>
-            <w:pPr>
-              <w:widowControl/>
-              <w:spacing w:line="320" w:lineRule="exact"/>
-              <w:jc w:val="center"/>
-              <w:rPr>
                 <w:rFonts w:ascii="微软雅黑" w:eastAsia="微软雅黑" w:hAnsi="微软雅黑"/>
-                <w:b/>
-                <w:bCs/>
-                <w:sz w:val="24"/>
-              </w:rPr>
-            </w:pPr>
-            <w:r>
-              <w:rPr>
-                <w:rFonts w:ascii="微软雅黑" w:eastAsia="微软雅黑" w:hAnsi="微软雅黑" w:hint="eastAsia"/>
-                <w:b/>
-                <w:bCs/>
-                <w:sz w:val="24"/>
-              </w:rPr>
-              <w:t>项目B</w:t>
-            </w:r>
-          </w:p>
-        </w:tc>
-        <w:tc>
-          <w:tcPr>
-            <w:tcW w:w="851" w:type="dxa"/>
-            <w:vAlign w:val="center"/>
-          </w:tcPr>
+                <w:bCs/>
+                <w:sz w:val="24"/>
+              </w:rPr>
+              <w:t xml:space="preserve">已完成统一总线 SoC 集成，接入 32KB 指令/数据存储、LED/Switch/SEG7 等 MMIO 外设及性能计数器，实现 CPU、存储、I/O、统计与显示的完整闭环。在此基础上完成 MAC </w:t>
+            </w:r>
+            <w:proofErr w:type="gramStart"/>
+            <w:r>
+              <w:rPr>
+                <w:rFonts w:ascii="微软雅黑" w:eastAsia="微软雅黑" w:hAnsi="微软雅黑"/>
+                <w:bCs/>
+                <w:sz w:val="24"/>
+              </w:rPr>
+              <w:t>点积加速</w:t>
+            </w:r>
+            <w:proofErr w:type="gramEnd"/>
+            <w:r>
+              <w:rPr>
+                <w:rFonts w:ascii="微软雅黑" w:eastAsia="微软雅黑" w:hAnsi="微软雅黑"/>
+                <w:bCs/>
+                <w:sz w:val="24"/>
+              </w:rPr>
+              <w:t>、五级流水线、forwarding/load-use stall/branch flush、BTB 动态分支预测等性能优化，并实现 VGA + S1~S5 按键小游戏骨架上板演示。项目已形成从功能正确性到性能提升、从仿真验证到硬件演示的完整链路</w:t>
+            </w:r>
+            <w:r>
+              <w:rPr>
+                <w:rFonts w:ascii="微软雅黑" w:eastAsia="微软雅黑" w:hAnsi="微软雅黑" w:hint="eastAsia"/>
+                <w:bCs/>
+                <w:sz w:val="24"/>
+              </w:rPr>
+              <w:t>，</w:t>
+            </w:r>
+            <w:r>
+              <w:rPr>
+                <w:rFonts w:ascii="微软雅黑" w:eastAsia="微软雅黑" w:hAnsi="微软雅黑"/>
+                <w:bCs/>
+                <w:sz w:val="24"/>
+              </w:rPr>
+              <w:t>PPA 实测与完整 SoC 重综合数据</w:t>
+            </w:r>
+            <w:r>
+              <w:rPr>
+                <w:rFonts w:ascii="微软雅黑" w:eastAsia="微软雅黑" w:hAnsi="微软雅黑" w:hint="eastAsia"/>
+                <w:bCs/>
+                <w:sz w:val="24"/>
+              </w:rPr>
+              <w:t>也已补充。</w:t>
+            </w:r>
+            <w:r>
+              <w:rPr>
+                <w:rFonts w:ascii="微软雅黑" w:eastAsia="微软雅黑" w:hAnsi="微软雅黑"/>
+                <w:bCs/>
+                <w:sz w:val="24"/>
+              </w:rPr>
+              <w:t>。</w:t>
+            </w:r>
+          </w:p>
           <w:p>
             <w:pPr>
               <w:widowControl/>
@@ -413,122 +489,6 @@
                 <w:sz w:val="24"/>
               </w:rPr>
             </w:pPr>
-            <w:r>
-              <w:rPr>
-                <w:rFonts w:ascii="微软雅黑" w:eastAsia="微软雅黑" w:hAnsi="微软雅黑" w:hint="eastAsia"/>
-                <w:b/>
-                <w:bCs/>
-                <w:sz w:val="24"/>
-              </w:rPr>
-              <w:t>基础</w:t>
-            </w:r>
-          </w:p>
-        </w:tc>
-        <w:tc>
-          <w:tcPr>
-            <w:tcW w:w="4394" w:type="dxa"/>
-            <w:gridSpan w:val="2"/>
-            <w:vAlign w:val="center"/>
-          </w:tcPr>
-          <w:p>
-            <w:pPr>
-              <w:widowControl/>
-              <w:spacing w:line="320" w:lineRule="exact"/>
-              <w:jc w:val="left"/>
-              <w:rPr>
-                <w:rFonts w:ascii="微软雅黑" w:eastAsia="微软雅黑" w:hAnsi="微软雅黑"/>
-                <w:bCs/>
-                <w:sz w:val="24"/>
-              </w:rPr>
-            </w:pPr>
-            <w:r>
-              <w:rPr>
-                <w:rFonts w:ascii="微软雅黑" w:eastAsia="微软雅黑" w:hAnsi="微软雅黑" w:hint="eastAsia"/>
-                <w:bCs/>
-                <w:sz w:val="24"/>
-              </w:rPr>
-              <w:t>（简述基础层次</w:t>
-            </w:r>
-            <w:r>
-              <w:rPr>
-                <w:rFonts w:ascii="微软雅黑" w:eastAsia="微软雅黑" w:hAnsi="微软雅黑" w:hint="eastAsia"/>
-                <w:bCs/>
-                <w:sz w:val="24"/>
-              </w:rPr>
-              <w:t>C</w:t>
-            </w:r>
-            <w:r>
-              <w:rPr>
-                <w:rFonts w:ascii="微软雅黑" w:eastAsia="微软雅黑" w:hAnsi="微软雅黑"/>
-                <w:bCs/>
-                <w:sz w:val="24"/>
-              </w:rPr>
-              <w:t>PU</w:t>
-            </w:r>
-            <w:r>
-              <w:rPr>
-                <w:rFonts w:ascii="微软雅黑" w:eastAsia="微软雅黑" w:hAnsi="微软雅黑" w:hint="eastAsia"/>
-                <w:bCs/>
-                <w:sz w:val="24"/>
-              </w:rPr>
-              <w:t>完成情况）</w:t>
-            </w:r>
-          </w:p>
-        </w:tc>
-        <w:tc>
-          <w:tcPr>
-            <w:tcW w:w="709" w:type="dxa"/>
-            <w:vAlign w:val="center"/>
-          </w:tcPr>
-          <w:p>
-            <w:pPr>
-              <w:widowControl/>
-              <w:spacing w:line="320" w:lineRule="exact"/>
-              <w:jc w:val="left"/>
-              <w:rPr>
-                <w:rFonts w:ascii="微软雅黑" w:eastAsia="微软雅黑" w:hAnsi="微软雅黑"/>
-                <w:b/>
-                <w:bCs/>
-                <w:sz w:val="24"/>
-              </w:rPr>
-            </w:pPr>
-            <w:r>
-              <w:rPr>
-                <w:rFonts w:ascii="微软雅黑" w:eastAsia="微软雅黑" w:hAnsi="微软雅黑" w:hint="eastAsia"/>
-                <w:b/>
-                <w:bCs/>
-                <w:sz w:val="24"/>
-              </w:rPr>
-              <w:t>进阶与拓展</w:t>
-            </w:r>
-          </w:p>
-        </w:tc>
-        <w:tc>
-          <w:tcPr>
-            <w:tcW w:w="5812" w:type="dxa"/>
-            <w:gridSpan w:val="2"/>
-            <w:vAlign w:val="center"/>
-          </w:tcPr>
-          <w:p>
-            <w:pPr>
-              <w:widowControl/>
-              <w:spacing w:line="320" w:lineRule="exact"/>
-              <w:jc w:val="left"/>
-              <w:rPr>
-                <w:rFonts w:ascii="微软雅黑" w:eastAsia="微软雅黑" w:hAnsi="微软雅黑"/>
-                <w:b/>
-                <w:bCs/>
-                <w:sz w:val="24"/>
-              </w:rPr>
-            </w:pPr>
-            <w:r>
-              <w:rPr>
-                <w:rFonts w:ascii="微软雅黑" w:eastAsia="微软雅黑" w:hAnsi="微软雅黑" w:hint="eastAsia"/>
-                <w:bCs/>
-                <w:sz w:val="24"/>
-              </w:rPr>
-              <w:t>（简述进阶与拓展层次完成情况）</w:t>
-            </w:r>
           </w:p>
         </w:tc>
       </w:tr>
@@ -547,38 +507,20 @@
               <w:spacing w:line="320" w:lineRule="exact"/>
               <w:jc w:val="center"/>
               <w:rPr>
-                <w:rFonts w:ascii="微软雅黑" w:eastAsia="微软雅黑" w:hAnsi="微软雅黑"/>
-                <w:b/>
-                <w:bCs/>
-                <w:sz w:val="24"/>
-              </w:rPr>
-            </w:pPr>
-            <w:r>
-              <w:rPr>
-                <w:rFonts w:ascii="微软雅黑" w:eastAsia="微软雅黑" w:hAnsi="微软雅黑" w:hint="eastAsia"/>
-                <w:b/>
-                <w:bCs/>
-                <w:sz w:val="24"/>
-              </w:rPr>
-              <w:t>学</w:t>
-            </w:r>
-            <w:r>
-              <w:rPr>
-                <w:rFonts w:ascii="微软雅黑" w:eastAsia="微软雅黑" w:hAnsi="微软雅黑" w:hint="eastAsia"/>
-                <w:b/>
-                <w:bCs/>
-                <w:sz w:val="24"/>
-              </w:rPr>
-              <w:t xml:space="preserve"> </w:t>
-            </w:r>
-            <w:r>
-              <w:rPr>
-                <w:rFonts w:ascii="微软雅黑" w:eastAsia="微软雅黑" w:hAnsi="微软雅黑" w:hint="eastAsia"/>
-                <w:b/>
-                <w:bCs/>
-                <w:sz w:val="24"/>
-              </w:rPr>
-              <w:t>号</w:t>
+                <w:rFonts w:ascii="微软雅黑" w:eastAsia="微软雅黑" w:hAnsi="微软雅黑" w:hint="eastAsia"/>
+                <w:b/>
+                <w:bCs/>
+                <w:sz w:val="24"/>
+              </w:rPr>
+            </w:pPr>
+            <w:r>
+              <w:rPr>
+                <w:rFonts w:ascii="微软雅黑" w:eastAsia="微软雅黑" w:hAnsi="微软雅黑" w:hint="eastAsia"/>
+                <w:b/>
+                <w:bCs/>
+                <w:sz w:val="24"/>
+              </w:rPr>
+              <w:t>学 号</w:t>
             </w:r>
           </w:p>
         </w:tc>
@@ -594,7 +536,7 @@
               <w:spacing w:line="320" w:lineRule="exact"/>
               <w:jc w:val="center"/>
               <w:rPr>
-                <w:rFonts w:ascii="微软雅黑" w:eastAsia="微软雅黑" w:hAnsi="微软雅黑"/>
+                <w:rFonts w:ascii="微软雅黑" w:eastAsia="微软雅黑" w:hAnsi="微软雅黑" w:hint="eastAsia"/>
                 <w:b/>
                 <w:bCs/>
                 <w:sz w:val="24"/>
@@ -623,7 +565,7 @@
               <w:spacing w:line="320" w:lineRule="exact"/>
               <w:jc w:val="center"/>
               <w:rPr>
-                <w:rFonts w:ascii="微软雅黑" w:eastAsia="微软雅黑" w:hAnsi="微软雅黑"/>
+                <w:rFonts w:ascii="微软雅黑" w:eastAsia="微软雅黑" w:hAnsi="微软雅黑" w:hint="eastAsia"/>
                 <w:b/>
                 <w:bCs/>
                 <w:sz w:val="24"/>
@@ -651,56 +593,20 @@
               <w:spacing w:line="320" w:lineRule="exact"/>
               <w:jc w:val="center"/>
               <w:rPr>
-                <w:rFonts w:ascii="微软雅黑" w:eastAsia="微软雅黑" w:hAnsi="微软雅黑"/>
-                <w:b/>
-                <w:bCs/>
-                <w:sz w:val="24"/>
-              </w:rPr>
-            </w:pPr>
-            <w:r>
-              <w:rPr>
-                <w:rFonts w:ascii="微软雅黑" w:eastAsia="微软雅黑" w:hAnsi="微软雅黑" w:hint="eastAsia"/>
-                <w:b/>
-                <w:bCs/>
-                <w:sz w:val="24"/>
-              </w:rPr>
-              <w:t>贡献度</w:t>
-            </w:r>
-            <w:r>
-              <w:rPr>
-                <w:rFonts w:ascii="微软雅黑" w:eastAsia="微软雅黑" w:hAnsi="微软雅黑" w:hint="eastAsia"/>
-                <w:b/>
-                <w:bCs/>
-                <w:sz w:val="24"/>
-              </w:rPr>
-              <w:t>（</w:t>
-            </w:r>
-            <w:r>
-              <w:rPr>
-                <w:rFonts w:ascii="微软雅黑" w:eastAsia="微软雅黑" w:hAnsi="微软雅黑" w:hint="eastAsia"/>
-                <w:b/>
-                <w:bCs/>
-                <w:sz w:val="24"/>
-              </w:rPr>
-              <w:t>总数</w:t>
-            </w:r>
-            <w:r>
-              <w:rPr>
-                <w:rFonts w:ascii="微软雅黑" w:eastAsia="微软雅黑" w:hAnsi="微软雅黑" w:hint="eastAsia"/>
-                <w:b/>
-                <w:bCs/>
-                <w:sz w:val="24"/>
-              </w:rPr>
-              <w:t>100%</w:t>
-            </w:r>
-            <w:r>
-              <w:rPr>
-                <w:rFonts w:ascii="微软雅黑" w:eastAsia="微软雅黑" w:hAnsi="微软雅黑" w:hint="eastAsia"/>
-                <w:b/>
-                <w:bCs/>
-                <w:sz w:val="24"/>
-              </w:rPr>
-              <w:t>）</w:t>
+                <w:rFonts w:ascii="微软雅黑" w:eastAsia="微软雅黑" w:hAnsi="微软雅黑" w:hint="eastAsia"/>
+                <w:b/>
+                <w:bCs/>
+                <w:sz w:val="24"/>
+              </w:rPr>
+            </w:pPr>
+            <w:r>
+              <w:rPr>
+                <w:rFonts w:ascii="微软雅黑" w:eastAsia="微软雅黑" w:hAnsi="微软雅黑" w:hint="eastAsia"/>
+                <w:b/>
+                <w:bCs/>
+                <w:sz w:val="24"/>
+              </w:rPr>
+              <w:t>贡献度（总数100%）</w:t>
             </w:r>
           </w:p>
         </w:tc>
@@ -720,12 +626,21 @@
               <w:spacing w:line="320" w:lineRule="exact"/>
               <w:jc w:val="center"/>
               <w:rPr>
-                <w:rFonts w:ascii="宋体" w:hAnsi="宋体"/>
-                <w:b/>
-                <w:bCs/>
-                <w:sz w:val="24"/>
-              </w:rPr>
-            </w:pPr>
+                <w:rFonts w:ascii="宋体" w:hAnsi="宋体" w:hint="eastAsia"/>
+                <w:b/>
+                <w:bCs/>
+                <w:sz w:val="24"/>
+              </w:rPr>
+            </w:pPr>
+            <w:r>
+              <w:rPr>
+                <w:rFonts w:ascii="幼圆" w:eastAsia="幼圆" w:hAnsi="宋体"/>
+                <w:b/>
+                <w:bCs/>
+                <w:sz w:val="24"/>
+              </w:rPr>
+              <w:t>2024212936</w:t>
+            </w:r>
           </w:p>
         </w:tc>
         <w:tc>
@@ -740,12 +655,21 @@
               <w:spacing w:line="320" w:lineRule="exact"/>
               <w:jc w:val="center"/>
               <w:rPr>
-                <w:rFonts w:ascii="宋体" w:hAnsi="宋体"/>
-                <w:b/>
-                <w:bCs/>
-                <w:sz w:val="24"/>
-              </w:rPr>
-            </w:pPr>
+                <w:rFonts w:ascii="宋体" w:hAnsi="宋体" w:hint="eastAsia"/>
+                <w:b/>
+                <w:bCs/>
+                <w:sz w:val="24"/>
+              </w:rPr>
+            </w:pPr>
+            <w:r>
+              <w:rPr>
+                <w:rFonts w:ascii="宋体" w:hAnsi="宋体" w:hint="eastAsia"/>
+                <w:b/>
+                <w:bCs/>
+                <w:sz w:val="24"/>
+              </w:rPr>
+              <w:t>刘文涛</w:t>
+            </w:r>
           </w:p>
         </w:tc>
         <w:tc>
@@ -760,12 +684,21 @@
               <w:spacing w:line="320" w:lineRule="exact"/>
               <w:jc w:val="center"/>
               <w:rPr>
+                <w:rFonts w:ascii="宋体" w:hAnsi="宋体" w:hint="eastAsia"/>
+                <w:b/>
+                <w:bCs/>
+                <w:sz w:val="24"/>
+              </w:rPr>
+            </w:pPr>
+            <w:r>
+              <w:rPr>
                 <w:rFonts w:ascii="宋体" w:hAnsi="宋体"/>
                 <w:b/>
                 <w:bCs/>
                 <w:sz w:val="24"/>
               </w:rPr>
-            </w:pPr>
+              <w:t>负责总体架构、ISA/memory map/interfaces 设计、五仓库深度合并、CPU/SoC 总体集成、五级流水线与 BTB 方案设计，同时负责文档统筹、报告整理和验收汇报，主导项目从方案到交付的整体推进。</w:t>
+            </w:r>
           </w:p>
         </w:tc>
         <w:tc>
@@ -779,12 +712,227 @@
               <w:spacing w:line="320" w:lineRule="exact"/>
               <w:jc w:val="center"/>
               <w:rPr>
+                <w:rFonts w:ascii="宋体" w:hAnsi="宋体" w:hint="eastAsia"/>
+                <w:b/>
+                <w:bCs/>
+                <w:sz w:val="24"/>
+              </w:rPr>
+            </w:pPr>
+            <w:r>
+              <w:rPr>
+                <w:rFonts w:ascii="宋体" w:hAnsi="宋体" w:hint="eastAsia"/>
+                <w:b/>
+                <w:bCs/>
+                <w:sz w:val="24"/>
+              </w:rPr>
+              <w:t>25%</w:t>
+            </w:r>
+          </w:p>
+        </w:tc>
+      </w:tr>
+      <w:tr>
+        <w:trPr>
+          <w:trHeight w:hRule="exact" w:val="1417"/>
+        </w:trPr>
+        <w:tc>
+          <w:tcPr>
+            <w:tcW w:w="1588" w:type="dxa"/>
+            <w:vAlign w:val="center"/>
+          </w:tcPr>
+          <w:p>
+            <w:pPr>
+              <w:widowControl/>
+              <w:spacing w:line="320" w:lineRule="exact"/>
+              <w:jc w:val="center"/>
+              <w:rPr>
+                <w:rFonts w:ascii="宋体" w:hAnsi="宋体" w:hint="eastAsia"/>
+                <w:b/>
+                <w:bCs/>
+                <w:sz w:val="24"/>
+              </w:rPr>
+            </w:pPr>
+            <w:r>
+              <w:rPr>
+                <w:rFonts w:ascii="幼圆" w:eastAsia="幼圆" w:hAnsi="宋体"/>
+                <w:b/>
+                <w:bCs/>
+                <w:sz w:val="24"/>
+              </w:rPr>
+              <w:t>20242129</w:t>
+            </w:r>
+            <w:r>
+              <w:rPr>
+                <w:rFonts w:ascii="幼圆" w:eastAsia="幼圆" w:hAnsi="宋体" w:hint="eastAsia"/>
+                <w:b/>
+                <w:bCs/>
+                <w:sz w:val="24"/>
+              </w:rPr>
+              <w:t>98</w:t>
+            </w:r>
+          </w:p>
+        </w:tc>
+        <w:tc>
+          <w:tcPr>
+            <w:tcW w:w="1701" w:type="dxa"/>
+            <w:gridSpan w:val="2"/>
+            <w:vAlign w:val="center"/>
+          </w:tcPr>
+          <w:p>
+            <w:pPr>
+              <w:widowControl/>
+              <w:spacing w:line="320" w:lineRule="exact"/>
+              <w:jc w:val="center"/>
+              <w:rPr>
+                <w:rFonts w:ascii="宋体" w:hAnsi="宋体" w:hint="eastAsia"/>
+                <w:b/>
+                <w:bCs/>
+                <w:sz w:val="24"/>
+              </w:rPr>
+            </w:pPr>
+            <w:r>
+              <w:rPr>
+                <w:rFonts w:ascii="宋体" w:hAnsi="宋体" w:hint="eastAsia"/>
+                <w:b/>
+                <w:bCs/>
+                <w:sz w:val="24"/>
+              </w:rPr>
+              <w:t>张淇</w:t>
+            </w:r>
+          </w:p>
+        </w:tc>
+        <w:tc>
+          <w:tcPr>
+            <w:tcW w:w="7698" w:type="dxa"/>
+            <w:gridSpan w:val="3"/>
+            <w:vAlign w:val="center"/>
+          </w:tcPr>
+          <w:p>
+            <w:pPr>
+              <w:widowControl/>
+              <w:spacing w:line="320" w:lineRule="exact"/>
+              <w:jc w:val="center"/>
+              <w:rPr>
+                <w:rFonts w:ascii="宋体" w:hAnsi="宋体" w:hint="eastAsia"/>
+                <w:b/>
+                <w:bCs/>
+                <w:sz w:val="24"/>
+              </w:rPr>
+            </w:pPr>
+            <w:r>
+              <w:rPr>
                 <w:rFonts w:ascii="宋体" w:hAnsi="宋体"/>
                 <w:b/>
                 <w:bCs/>
                 <w:sz w:val="24"/>
               </w:rPr>
-            </w:pPr>
+              <w:t>负责 RV32I 多周期 CPU 核心验证与基础功能仿真，</w:t>
+            </w:r>
+            <w:proofErr w:type="spellStart"/>
+            <w:r>
+              <w:rPr>
+                <w:rFonts w:ascii="宋体" w:hAnsi="宋体"/>
+                <w:b/>
+                <w:bCs/>
+                <w:sz w:val="24"/>
+              </w:rPr>
+              <w:t>Minisys</w:t>
+            </w:r>
+            <w:proofErr w:type="spellEnd"/>
+            <w:r>
+              <w:rPr>
+                <w:rFonts w:ascii="宋体" w:hAnsi="宋体"/>
+                <w:b/>
+                <w:bCs/>
+                <w:sz w:val="24"/>
+              </w:rPr>
+              <w:t xml:space="preserve"> 上板验证</w:t>
+            </w:r>
+            <w:r>
+              <w:rPr>
+                <w:rFonts w:ascii="宋体" w:hAnsi="宋体" w:hint="eastAsia"/>
+                <w:b/>
+                <w:bCs/>
+                <w:sz w:val="24"/>
+              </w:rPr>
+              <w:t>，</w:t>
+            </w:r>
+            <w:r>
+              <w:rPr>
+                <w:rFonts w:ascii="宋体" w:hAnsi="宋体"/>
+                <w:b/>
+                <w:bCs/>
+                <w:sz w:val="24"/>
+              </w:rPr>
+              <w:t>完成 ALU/</w:t>
+            </w:r>
+            <w:proofErr w:type="spellStart"/>
+            <w:r>
+              <w:rPr>
+                <w:rFonts w:ascii="宋体" w:hAnsi="宋体"/>
+                <w:b/>
+                <w:bCs/>
+                <w:sz w:val="24"/>
+              </w:rPr>
+              <w:t>regfile</w:t>
+            </w:r>
+            <w:proofErr w:type="spellEnd"/>
+            <w:r>
+              <w:rPr>
+                <w:rFonts w:ascii="宋体" w:hAnsi="宋体"/>
+                <w:b/>
+                <w:bCs/>
+                <w:sz w:val="24"/>
+              </w:rPr>
+              <w:t xml:space="preserve">/control/basic/LW-SW/BEQ-BNE 等测试，推动 </w:t>
+            </w:r>
+            <w:proofErr w:type="spellStart"/>
+            <w:r>
+              <w:rPr>
+                <w:rFonts w:ascii="宋体" w:hAnsi="宋体"/>
+                <w:b/>
+                <w:bCs/>
+                <w:sz w:val="24"/>
+              </w:rPr>
+              <w:t>Vivado</w:t>
+            </w:r>
+            <w:proofErr w:type="spellEnd"/>
+            <w:r>
+              <w:rPr>
+                <w:rFonts w:ascii="宋体" w:hAnsi="宋体"/>
+                <w:b/>
+                <w:bCs/>
+                <w:sz w:val="24"/>
+              </w:rPr>
+              <w:t xml:space="preserve"> 综合、实现与 bitstream 验证，并完成 VGA + 按键小游戏骨架上板验证，确保 CPU 基础功能和硬件落地可靠。</w:t>
+            </w:r>
+          </w:p>
+        </w:tc>
+        <w:tc>
+          <w:tcPr>
+            <w:tcW w:w="2367" w:type="dxa"/>
+            <w:vAlign w:val="center"/>
+          </w:tcPr>
+          <w:p>
+            <w:pPr>
+              <w:widowControl/>
+              <w:spacing w:line="320" w:lineRule="exact"/>
+              <w:jc w:val="center"/>
+              <w:rPr>
+                <w:rFonts w:ascii="宋体" w:hAnsi="宋体" w:hint="eastAsia"/>
+                <w:b/>
+                <w:bCs/>
+                <w:sz w:val="24"/>
+              </w:rPr>
+            </w:pPr>
+            <w:r>
+              <w:rPr>
+                <w:rFonts w:ascii="宋体" w:hAnsi="宋体" w:hint="eastAsia"/>
+                <w:b/>
+                <w:bCs/>
+                <w:sz w:val="24"/>
+              </w:rPr>
+              <w:t>25%</w:t>
+            </w:r>
           </w:p>
         </w:tc>
       </w:tr>
@@ -803,12 +951,30 @@
               <w:spacing w:line="320" w:lineRule="exact"/>
               <w:jc w:val="center"/>
               <w:rPr>
-                <w:rFonts w:ascii="宋体" w:hAnsi="宋体"/>
-                <w:b/>
-                <w:bCs/>
-                <w:sz w:val="24"/>
-              </w:rPr>
-            </w:pPr>
+                <w:rFonts w:ascii="宋体" w:hAnsi="宋体" w:hint="eastAsia"/>
+                <w:b/>
+                <w:bCs/>
+                <w:sz w:val="24"/>
+              </w:rPr>
+            </w:pPr>
+            <w:r>
+              <w:rPr>
+                <w:rFonts w:ascii="幼圆" w:eastAsia="幼圆" w:hAnsi="宋体"/>
+                <w:b/>
+                <w:bCs/>
+                <w:sz w:val="24"/>
+              </w:rPr>
+              <w:t>2024212</w:t>
+            </w:r>
+            <w:r>
+              <w:rPr>
+                <w:rFonts w:ascii="幼圆" w:eastAsia="幼圆" w:hAnsi="宋体" w:hint="eastAsia"/>
+                <w:b/>
+                <w:bCs/>
+                <w:sz w:val="24"/>
+              </w:rPr>
+              <w:t>582</w:t>
+            </w:r>
           </w:p>
         </w:tc>
         <w:tc>
@@ -823,12 +989,21 @@
               <w:spacing w:line="320" w:lineRule="exact"/>
               <w:jc w:val="center"/>
               <w:rPr>
-                <w:rFonts w:ascii="宋体" w:hAnsi="宋体"/>
-                <w:b/>
-                <w:bCs/>
-                <w:sz w:val="24"/>
-              </w:rPr>
-            </w:pPr>
+                <w:rFonts w:ascii="宋体" w:hAnsi="宋体" w:hint="eastAsia"/>
+                <w:b/>
+                <w:bCs/>
+                <w:sz w:val="24"/>
+              </w:rPr>
+            </w:pPr>
+            <w:r>
+              <w:rPr>
+                <w:rFonts w:ascii="宋体" w:hAnsi="宋体" w:hint="eastAsia"/>
+                <w:b/>
+                <w:bCs/>
+                <w:sz w:val="24"/>
+              </w:rPr>
+              <w:t>胡文龙</w:t>
+            </w:r>
           </w:p>
         </w:tc>
         <w:tc>
@@ -843,12 +1018,21 @@
               <w:spacing w:line="320" w:lineRule="exact"/>
               <w:jc w:val="center"/>
               <w:rPr>
+                <w:rFonts w:ascii="宋体" w:hAnsi="宋体" w:hint="eastAsia"/>
+                <w:b/>
+                <w:bCs/>
+                <w:sz w:val="24"/>
+              </w:rPr>
+            </w:pPr>
+            <w:r>
+              <w:rPr>
                 <w:rFonts w:ascii="宋体" w:hAnsi="宋体"/>
                 <w:b/>
                 <w:bCs/>
                 <w:sz w:val="24"/>
               </w:rPr>
-            </w:pPr>
+              <w:t>负责 SoC / Memory / I/O / 板级顶层与约束、VGA 与按键交互链路联调，并负责 PPT 汇报生成与展示材料整理，推动项目演示效果和答辩表现落地</w:t>
+            </w:r>
           </w:p>
         </w:tc>
         <w:tc>
@@ -862,12 +1046,21 @@
               <w:spacing w:line="320" w:lineRule="exact"/>
               <w:jc w:val="center"/>
               <w:rPr>
-                <w:rFonts w:ascii="宋体" w:hAnsi="宋体"/>
-                <w:b/>
-                <w:bCs/>
-                <w:sz w:val="24"/>
-              </w:rPr>
-            </w:pPr>
+                <w:rFonts w:ascii="宋体" w:hAnsi="宋体" w:hint="eastAsia"/>
+                <w:b/>
+                <w:bCs/>
+                <w:sz w:val="24"/>
+              </w:rPr>
+            </w:pPr>
+            <w:r>
+              <w:rPr>
+                <w:rFonts w:ascii="宋体" w:hAnsi="宋体" w:hint="eastAsia"/>
+                <w:b/>
+                <w:bCs/>
+                <w:sz w:val="24"/>
+              </w:rPr>
+              <w:t>25%</w:t>
+            </w:r>
           </w:p>
         </w:tc>
       </w:tr>
@@ -886,12 +1079,30 @@
               <w:spacing w:line="320" w:lineRule="exact"/>
               <w:jc w:val="center"/>
               <w:rPr>
-                <w:rFonts w:ascii="宋体" w:hAnsi="宋体"/>
-                <w:b/>
-                <w:bCs/>
-                <w:sz w:val="24"/>
-              </w:rPr>
-            </w:pPr>
+                <w:rFonts w:ascii="宋体" w:hAnsi="宋体" w:hint="eastAsia"/>
+                <w:b/>
+                <w:bCs/>
+                <w:sz w:val="24"/>
+              </w:rPr>
+            </w:pPr>
+            <w:r>
+              <w:rPr>
+                <w:rFonts w:ascii="幼圆" w:eastAsia="幼圆" w:hAnsi="宋体"/>
+                <w:b/>
+                <w:bCs/>
+                <w:sz w:val="24"/>
+              </w:rPr>
+              <w:t>2024212</w:t>
+            </w:r>
+            <w:r>
+              <w:rPr>
+                <w:rFonts w:ascii="幼圆" w:eastAsia="幼圆" w:hAnsi="宋体" w:hint="eastAsia"/>
+                <w:b/>
+                <w:bCs/>
+                <w:sz w:val="24"/>
+              </w:rPr>
+              <w:t>590</w:t>
+            </w:r>
           </w:p>
         </w:tc>
         <w:tc>
@@ -906,12 +1117,21 @@
               <w:spacing w:line="320" w:lineRule="exact"/>
               <w:jc w:val="center"/>
               <w:rPr>
-                <w:rFonts w:ascii="宋体" w:hAnsi="宋体"/>
-                <w:b/>
-                <w:bCs/>
-                <w:sz w:val="24"/>
-              </w:rPr>
-            </w:pPr>
+                <w:rFonts w:ascii="宋体" w:hAnsi="宋体" w:hint="eastAsia"/>
+                <w:b/>
+                <w:bCs/>
+                <w:sz w:val="24"/>
+              </w:rPr>
+            </w:pPr>
+            <w:r>
+              <w:rPr>
+                <w:rFonts w:ascii="宋体" w:hAnsi="宋体" w:hint="eastAsia"/>
+                <w:b/>
+                <w:bCs/>
+                <w:sz w:val="24"/>
+              </w:rPr>
+              <w:t>王博生</w:t>
+            </w:r>
           </w:p>
         </w:tc>
         <w:tc>
@@ -926,12 +1146,41 @@
               <w:spacing w:line="320" w:lineRule="exact"/>
               <w:jc w:val="center"/>
               <w:rPr>
+                <w:rFonts w:ascii="宋体" w:hAnsi="宋体" w:hint="eastAsia"/>
+                <w:b/>
+                <w:bCs/>
+                <w:sz w:val="24"/>
+              </w:rPr>
+            </w:pPr>
+            <w:r>
+              <w:rPr>
                 <w:rFonts w:ascii="宋体" w:hAnsi="宋体"/>
                 <w:b/>
                 <w:bCs/>
                 <w:sz w:val="24"/>
               </w:rPr>
-            </w:pPr>
+              <w:t>负责 MAC 自定义指令、性能计数器、</w:t>
+            </w:r>
+            <w:proofErr w:type="gramStart"/>
+            <w:r>
+              <w:rPr>
+                <w:rFonts w:ascii="宋体" w:hAnsi="宋体"/>
+                <w:b/>
+                <w:bCs/>
+                <w:sz w:val="24"/>
+              </w:rPr>
+              <w:t>点积程序</w:t>
+            </w:r>
+            <w:proofErr w:type="gramEnd"/>
+            <w:r>
+              <w:rPr>
+                <w:rFonts w:ascii="宋体" w:hAnsi="宋体"/>
+                <w:b/>
+                <w:bCs/>
+                <w:sz w:val="24"/>
+              </w:rPr>
+              <w:t>、性能对比分析与 PPA 表格支撑，完成乘加加速效果的量化验证，为项目性能优化和效率展示提供数据依据。</w:t>
+            </w:r>
           </w:p>
         </w:tc>
         <w:tc>
@@ -945,95 +1194,21 @@
               <w:spacing w:line="320" w:lineRule="exact"/>
               <w:jc w:val="center"/>
               <w:rPr>
-                <w:rFonts w:ascii="宋体" w:hAnsi="宋体"/>
-                <w:b/>
-                <w:bCs/>
-                <w:sz w:val="24"/>
-              </w:rPr>
-            </w:pPr>
-          </w:p>
-        </w:tc>
-      </w:tr>
-      <w:tr>
-        <w:trPr>
-          <w:trHeight w:hRule="exact" w:val="1134"/>
-        </w:trPr>
-        <w:tc>
-          <w:tcPr>
-            <w:tcW w:w="1588" w:type="dxa"/>
-            <w:vAlign w:val="center"/>
-          </w:tcPr>
-          <w:p>
-            <w:pPr>
-              <w:widowControl/>
-              <w:spacing w:line="320" w:lineRule="exact"/>
-              <w:jc w:val="center"/>
-              <w:rPr>
-                <w:rFonts w:ascii="宋体" w:hAnsi="宋体"/>
-                <w:b/>
-                <w:bCs/>
-                <w:sz w:val="24"/>
-              </w:rPr>
-            </w:pPr>
-          </w:p>
-        </w:tc>
-        <w:tc>
-          <w:tcPr>
-            <w:tcW w:w="1701" w:type="dxa"/>
-            <w:gridSpan w:val="2"/>
-            <w:vAlign w:val="center"/>
-          </w:tcPr>
-          <w:p>
-            <w:pPr>
-              <w:widowControl/>
-              <w:spacing w:line="320" w:lineRule="exact"/>
-              <w:jc w:val="center"/>
-              <w:rPr>
-                <w:rFonts w:ascii="宋体" w:hAnsi="宋体"/>
-                <w:b/>
-                <w:bCs/>
-                <w:sz w:val="24"/>
-              </w:rPr>
-            </w:pPr>
-          </w:p>
-        </w:tc>
-        <w:tc>
-          <w:tcPr>
-            <w:tcW w:w="7698" w:type="dxa"/>
-            <w:gridSpan w:val="3"/>
-            <w:vAlign w:val="center"/>
-          </w:tcPr>
-          <w:p>
-            <w:pPr>
-              <w:widowControl/>
-              <w:spacing w:line="320" w:lineRule="exact"/>
-              <w:jc w:val="center"/>
-              <w:rPr>
-                <w:rFonts w:ascii="宋体" w:hAnsi="宋体"/>
-                <w:b/>
-                <w:bCs/>
-                <w:sz w:val="24"/>
-              </w:rPr>
-            </w:pPr>
-          </w:p>
-        </w:tc>
-        <w:tc>
-          <w:tcPr>
-            <w:tcW w:w="2367" w:type="dxa"/>
-            <w:vAlign w:val="center"/>
-          </w:tcPr>
-          <w:p>
-            <w:pPr>
-              <w:widowControl/>
-              <w:spacing w:line="320" w:lineRule="exact"/>
-              <w:jc w:val="center"/>
-              <w:rPr>
-                <w:rFonts w:ascii="宋体" w:hAnsi="宋体"/>
-                <w:b/>
-                <w:bCs/>
-                <w:sz w:val="24"/>
-              </w:rPr>
-            </w:pPr>
+                <w:rFonts w:ascii="宋体" w:hAnsi="宋体" w:hint="eastAsia"/>
+                <w:b/>
+                <w:bCs/>
+                <w:sz w:val="24"/>
+              </w:rPr>
+            </w:pPr>
+            <w:r>
+              <w:rPr>
+                <w:rFonts w:ascii="宋体" w:hAnsi="宋体" w:hint="eastAsia"/>
+                <w:b/>
+                <w:bCs/>
+                <w:sz w:val="24"/>
+              </w:rPr>
+              <w:t>25%</w:t>
+            </w:r>
           </w:p>
         </w:tc>
       </w:tr>
@@ -1049,8 +1224,46 @@
 </w:document>
 </file>
 
+<file path=word/endnotes.xml><?xml version="1.0" encoding="utf-8"?>
+<w:endnotes xmlns:wpc="http://schemas.microsoft.com/office/word/2010/wordprocessingCanvas" xmlns:cx="http://schemas.microsoft.com/office/drawing/2014/chartex" xmlns:cx1="http://schemas.microsoft.com/office/drawing/2015/9/8/chartex" xmlns:cx2="http://schemas.microsoft.com/office/drawing/2015/10/21/chartex" xmlns:cx3="http://schemas.microsoft.com/office/drawing/2016/5/9/chartex" xmlns:cx4="http://schemas.microsoft.com/office/drawing/2016/5/10/chartex" xmlns:cx5="http://schemas.microsoft.com/office/drawing/2016/5/11/chartex" xmlns:cx6="http://schemas.microsoft.com/office/drawing/2016/5/12/chartex" xmlns:cx7="http://schemas.microsoft.com/office/drawing/2016/5/13/chartex" xmlns:cx8="http://schemas.microsoft.com/office/drawing/2016/5/14/chartex" xmlns:mc="http://schemas.openxmlformats.org/markup-compatibility/2006" xmlns:aink="http://schemas.microsoft.com/office/drawing/2016/ink" xmlns:am3d="http://schemas.microsoft.com/office/drawing/2017/model3d" xmlns:o="urn:schemas-microsoft-com:office:office" xmlns:oel="http://schemas.microsoft.com/office/2019/extlst" xmlns:r="http://schemas.openxmlformats.org/officeDocument/2006/relationships" xmlns:m="http://schemas.openxmlformats.org/officeDocument/2006/math" xmlns:v="urn:schemas-microsoft-com:vml" xmlns:wp14="http://schemas.microsoft.com/office/word/2010/wordprocessingDrawing" xmlns:wp="http://schemas.openxmlformats.org/drawingml/2006/wordprocessingDrawing" xmlns:w10="urn:schemas-microsoft-com:office:word" xmlns:w="http://schemas.openxmlformats.org/wordprocessingml/2006/main" xmlns:w14="http://schemas.microsoft.com/office/word/2010/wordml" xmlns:w15="http://schemas.microsoft.com/office/word/2012/wordml" xmlns:w16cex="http://schemas.microsoft.com/office/word/2018/wordml/cex" xmlns:w16cid="http://schemas.microsoft.com/office/word/2016/wordml/cid" xmlns:w16="http://schemas.microsoft.com/office/word/2018/wordml" xmlns:w16du="http://schemas.microsoft.com/office/word/2023/wordml/word16du" xmlns:w16sdtdh="http://schemas.microsoft.com/office/word/2020/wordml/sdtdatahash" xmlns:w16sdtfl="http://schemas.microsoft.com/office/word/2024/wordml/sdtformatlock" xmlns:w16se="http://schemas.microsoft.com/office/word/2015/wordml/symex" xmlns:wpg="http://schemas.microsoft.com/office/word/2010/wordprocessingGroup" xmlns:wpi="http://schemas.microsoft.com/office/word/2010/wordprocessingInk" xmlns:wne="http://schemas.microsoft.com/office/word/2006/wordml" xmlns:wps="http://schemas.microsoft.com/office/word/2010/wordprocessingShape" mc:Ignorable="w14 w15 w16se w16cid w16 w16cex w16sdtdh w16sdtfl w16du wp14">
+  <w:endnote w:type="separator" w:id="-1">
+    <w:p>
+      <w:r>
+        <w:separator/>
+      </w:r>
+    </w:p>
+  </w:endnote>
+  <w:endnote w:type="continuationSeparator" w:id="0">
+    <w:p>
+      <w:r>
+        <w:continuationSeparator/>
+      </w:r>
+    </w:p>
+  </w:endnote>
+</w:endnotes>
+</file>
+
+<file path=word/footnotes.xml><?xml version="1.0" encoding="utf-8"?>
+<w:footnotes xmlns:wpc="http://schemas.microsoft.com/office/word/2010/wordprocessingCanvas" xmlns:cx="http://schemas.microsoft.com/office/drawing/2014/chartex" xmlns:cx1="http://schemas.microsoft.com/office/drawing/2015/9/8/chartex" xmlns:cx2="http://schemas.microsoft.com/office/drawing/2015/10/21/chartex" xmlns:cx3="http://schemas.microsoft.com/office/drawing/2016/5/9/chartex" xmlns:cx4="http://schemas.microsoft.com/office/drawing/2016/5/10/chartex" xmlns:cx5="http://schemas.microsoft.com/office/drawing/2016/5/11/chartex" xmlns:cx6="http://schemas.microsoft.com/office/drawing/2016/5/12/chartex" xmlns:cx7="http://schemas.microsoft.com/office/drawing/2016/5/13/chartex" xmlns:cx8="http://schemas.microsoft.com/office/drawing/2016/5/14/chartex" xmlns:mc="http://schemas.openxmlformats.org/markup-compatibility/2006" xmlns:aink="http://schemas.microsoft.com/office/drawing/2016/ink" xmlns:am3d="http://schemas.microsoft.com/office/drawing/2017/model3d" xmlns:o="urn:schemas-microsoft-com:office:office" xmlns:oel="http://schemas.microsoft.com/office/2019/extlst" xmlns:r="http://schemas.openxmlformats.org/officeDocument/2006/relationships" xmlns:m="http://schemas.openxmlformats.org/officeDocument/2006/math" xmlns:v="urn:schemas-microsoft-com:vml" xmlns:wp14="http://schemas.microsoft.com/office/word/2010/wordprocessingDrawing" xmlns:wp="http://schemas.openxmlformats.org/drawingml/2006/wordprocessingDrawing" xmlns:w10="urn:schemas-microsoft-com:office:word" xmlns:w="http://schemas.openxmlformats.org/wordprocessingml/2006/main" xmlns:w14="http://schemas.microsoft.com/office/word/2010/wordml" xmlns:w15="http://schemas.microsoft.com/office/word/2012/wordml" xmlns:w16cex="http://schemas.microsoft.com/office/word/2018/wordml/cex" xmlns:w16cid="http://schemas.microsoft.com/office/word/2016/wordml/cid" xmlns:w16="http://schemas.microsoft.com/office/word/2018/wordml" xmlns:w16du="http://schemas.microsoft.com/office/word/2023/wordml/word16du" xmlns:w16sdtdh="http://schemas.microsoft.com/office/word/2020/wordml/sdtdatahash" xmlns:w16sdtfl="http://schemas.microsoft.com/office/word/2024/wordml/sdtformatlock" xmlns:w16se="http://schemas.microsoft.com/office/word/2015/wordml/symex" xmlns:wpg="http://schemas.microsoft.com/office/word/2010/wordprocessingGroup" xmlns:wpi="http://schemas.microsoft.com/office/word/2010/wordprocessingInk" xmlns:wne="http://schemas.microsoft.com/office/word/2006/wordml" xmlns:wps="http://schemas.microsoft.com/office/word/2010/wordprocessingShape" mc:Ignorable="w14 w15 w16se w16cid w16 w16cex w16sdtdh w16sdtfl w16du wp14">
+  <w:footnote w:type="separator" w:id="-1">
+    <w:p>
+      <w:r>
+        <w:separator/>
+      </w:r>
+    </w:p>
+  </w:footnote>
+  <w:footnote w:type="continuationSeparator" w:id="0">
+    <w:p>
+      <w:r>
+        <w:continuationSeparator/>
+      </w:r>
+    </w:p>
+  </w:footnote>
+</w:footnotes>
+</file>
+
 <file path=word/styles.xml><?xml version="1.0" encoding="utf-8"?>
-<w:styles xmlns:mc="http://schemas.openxmlformats.org/markup-compatibility/2006" xmlns:r="http://schemas.openxmlformats.org/officeDocument/2006/relationships" xmlns:w="http://schemas.openxmlformats.org/wordprocessingml/2006/main" xmlns:w14="http://schemas.microsoft.com/office/word/2010/wordml" xmlns:w15="http://schemas.microsoft.com/office/word/2012/wordml" xmlns:w16se="http://schemas.microsoft.com/office/word/2015/wordml/symex" mc:Ignorable="w14 w15 w16se">
+<w:styles xmlns:mc="http://schemas.openxmlformats.org/markup-compatibility/2006" xmlns:r="http://schemas.openxmlformats.org/officeDocument/2006/relationships" xmlns:w="http://schemas.openxmlformats.org/wordprocessingml/2006/main" xmlns:w14="http://schemas.microsoft.com/office/word/2010/wordml" xmlns:w15="http://schemas.microsoft.com/office/word/2012/wordml" xmlns:w16cex="http://schemas.microsoft.com/office/word/2018/wordml/cex" xmlns:w16cid="http://schemas.microsoft.com/office/word/2016/wordml/cid" xmlns:w16="http://schemas.microsoft.com/office/word/2018/wordml" xmlns:w16du="http://schemas.microsoft.com/office/word/2023/wordml/word16du" xmlns:w16sdtdh="http://schemas.microsoft.com/office/word/2020/wordml/sdtdatahash" xmlns:w16sdtfl="http://schemas.microsoft.com/office/word/2024/wordml/sdtformatlock" xmlns:w16se="http://schemas.microsoft.com/office/word/2015/wordml/symex" mc:Ignorable="w14 w15 w16se w16cid w16 w16cex w16sdtdh w16sdtfl w16du">
   <w:docDefaults>
     <w:rPrDefault>
       <w:rPr>
@@ -1060,7 +1273,7 @@
     </w:rPrDefault>
     <w:pPrDefault/>
   </w:docDefaults>
-  <w:latentStyles w:defLockedState="0" w:defUIPriority="99" w:defSemiHidden="0" w:defUnhideWhenUsed="0" w:defQFormat="0" w:count="371">
+  <w:latentStyles w:defLockedState="0" w:defUIPriority="99" w:defSemiHidden="0" w:defUnhideWhenUsed="0" w:defQFormat="0" w:count="376">
     <w:lsdException w:name="Normal" w:uiPriority="0" w:qFormat="1"/>
     <w:lsdException w:name="heading 1" w:uiPriority="9" w:qFormat="1"/>
     <w:lsdException w:name="heading 2" w:semiHidden="1" w:uiPriority="9" w:unhideWhenUsed="1" w:qFormat="1"/>
@@ -1215,7 +1428,7 @@
     <w:lsdException w:name="Table Web 2" w:semiHidden="1" w:unhideWhenUsed="1"/>
     <w:lsdException w:name="Table Web 3" w:semiHidden="1" w:unhideWhenUsed="1"/>
     <w:lsdException w:name="Balloon Text" w:semiHidden="1" w:unhideWhenUsed="1"/>
-    <w:lsdException w:name="Table Grid" w:semiHidden="1" w:uiPriority="39" w:unhideWhenUsed="1"/>
+    <w:lsdException w:name="Table Grid" w:uiPriority="39"/>
     <w:lsdException w:name="Table Theme" w:semiHidden="1" w:unhideWhenUsed="1"/>
     <w:lsdException w:name="Placeholder Text" w:semiHidden="1"/>
     <w:lsdException w:name="Light Shading" w:uiPriority="60"/>
@@ -1428,6 +1641,11 @@
     <w:lsdException w:name="List Table 5 Dark Accent 6" w:uiPriority="50"/>
     <w:lsdException w:name="List Table 6 Colorful Accent 6" w:uiPriority="51"/>
     <w:lsdException w:name="List Table 7 Colorful Accent 6" w:uiPriority="52"/>
+    <w:lsdException w:name="Mention" w:semiHidden="1" w:unhideWhenUsed="1"/>
+    <w:lsdException w:name="Smart Hyperlink" w:semiHidden="1" w:unhideWhenUsed="1"/>
+    <w:lsdException w:name="Hashtag" w:semiHidden="1" w:unhideWhenUsed="1"/>
+    <w:lsdException w:name="Unresolved Mention" w:semiHidden="1" w:unhideWhenUsed="1"/>
+    <w:lsdException w:name="Smart Link" w:semiHidden="1" w:unhideWhenUsed="1"/>
   </w:latentStyles>
   <w:style w:type="paragraph" w:default="1" w:styleId="a">
     <w:name w:val="Normal"/>
@@ -1445,7 +1663,6 @@
   <w:style w:type="character" w:default="1" w:styleId="a0">
     <w:name w:val="Default Paragraph Font"/>
     <w:uiPriority w:val="1"/>
-    <w:semiHidden/>
     <w:unhideWhenUsed/>
   </w:style>
   <w:style w:type="table" w:default="1" w:styleId="a1">

</xml_diff>